<commit_message>
docs: Betriebsdokumentation finalisieren und PDB-Konfiguration korrigieren
</commit_message>
<xml_diff>
--- a/dokumentation/10_uebergabe_und_betriebsanleitung.docx
+++ b/dokumentation/10_uebergabe_und_betriebsanleitung.docx
@@ -1,6 +1,6 @@
 
 <file path=word/document.xml><?xml version="1.0" encoding="utf-8"?>
-<w:document xmlns:wpc="http://schemas.microsoft.com/office/word/2010/wordprocessingCanvas" xmlns:mo="http://schemas.microsoft.com/office/mac/office/2008/main" xmlns:mc="http://schemas.openxmlformats.org/markup-compatibility/2006" xmlns:mv="urn:schemas-microsoft-com:mac:vml" xmlns:o="urn:schemas-microsoft-com:office:office" xmlns:r="http://schemas.openxmlformats.org/officeDocument/2006/relationships" xmlns:m="http://schemas.openxmlformats.org/officeDocument/2006/math" xmlns:v="urn:schemas-microsoft-com:vml" xmlns:wp14="http://schemas.microsoft.com/office/word/2010/wordprocessingDrawing" xmlns:wp="http://schemas.openxmlformats.org/drawingml/2006/wordprocessingDrawing" xmlns:w10="urn:schemas-microsoft-com:office:word" xmlns:w="http://schemas.openxmlformats.org/wordprocessingml/2006/main" xmlns:w14="http://schemas.microsoft.com/office/word/2010/wordml" xmlns:wpg="http://schemas.microsoft.com/office/word/2010/wordprocessingGroup" xmlns:wpi="http://schemas.microsoft.com/office/word/2010/wordprocessingInk" xmlns:wne="http://schemas.microsoft.com/office/word/2006/wordml" xmlns:wps="http://schemas.microsoft.com/office/word/2010/wordprocessingShape" mc:Ignorable="w14 wp14">
+<w:document xmlns:ns1="http://schemas.openxmlformats.org/markup-compatibility/2006" xmlns:ns2="http://schemas.openxmlformats.org/officeDocument/2006/relationships" xmlns:w="http://schemas.openxmlformats.org/wordprocessingml/2006/main" ns1:Ignorable="w14 wp14">
   <w:body>
     <w:p>
       <w:pPr>
@@ -749,7 +749,7 @@
               <w:rPr>
                 <w:sz w:val="14"/>
               </w:rPr>
-              <w:t>PR #36; Merge f62e055; PROD-IMAGE=a4c49abd81d9f5c4472b90110cb3fca5ae0348c2; Synced/Healthy</w:t>
+              <w:t>PR #36; Merge f62e05517b68adc7fc166eb6313de1f411acca8b; PROD-IMAGE=a4c49abd81d9f5c4472b90110cb3fca5ae0348c2; Synced/Healthy</w:t>
             </w:r>
           </w:p>
         </w:tc>
@@ -793,7 +793,7 @@
               <w:rPr>
                 <w:sz w:val="14"/>
               </w:rPr>
-              <w:t>PR #37; Revert 8d81e09; Merge f051d6087d7f0437b852c21f2045122f42ab1c22; PROD-IMAGE=2ae1f2e41c992fdbb81107aac79e66afe7ef2ea1; Synced/Healthy</w:t>
+              <w:t>PR #37; Revert 8d81e09; Merge 692b49bb3510a481406717c2fe4faa793f3c8e0f; PROD-IMAGE=2ae1f2e41c992fdbb81107aac79e66afe7ef2ea1; Synced/Healthy</w:t>
             </w:r>
           </w:p>
         </w:tc>
@@ -2704,7 +2704,7 @@
     <w:p/>
     <w:p>
       <w:r>
-        <w:t>Ein realer Rollback ist bereits über PR #37 mit Revert 8d81e09 und Merge f051d6087d7f0437b852c21f2045122f42ab1c22 dokumentiert; anschließend wurde PROD-IMAGE=2ae1f2e41c992fdbb81107aac79e66afe7ef2ea1 sowie Synced/Healthy nachgewiesen. Der aktuelle main-Stand des GitOps-Repositories wurde später wieder auf f62e055 zurückgesetzt; dies ändert nicht den erfolgreich durchgeführten und nachgewiesenen Rollback-Test T29.</w:t>
+        <w:t>Ein realer Rollback ist bereits über PR #37 mit Revert 8d81e09 und Merge 692b49bb3510a481406717c2fe4faa793f3c8e0f dokumentiert; anschließend wurde PROD-IMAGE=2ae1f2e41c992fdbb81107aac79e66afe7ef2ea1 sowie Synced/Healthy nachgewiesen. Der aktuelle main-Stand des GitOps-Repositories wurde später wieder auf f62e055 zurückgesetzt; dies ändert nicht den erfolgreich durchgeführten und nachgewiesenen Rollback-Test T29.</w:t>
       </w:r>
     </w:p>
     <w:p>
@@ -5477,7 +5477,7 @@
               <w:rPr>
                 <w:sz w:val="14"/>
               </w:rPr>
-              <w:t>Vor Abgabe aktuell erfassen.</w:t>
+              <w:t>Erfasst und mit den finalen Git-Ständen abgeglichen: pacman-app a4c49abd81d9f5c4472b90110cb3fca5ae0348c2; pacman-gitops 692b49bb3510a481406717c2fe4faa793f3c8e0f.</w:t>
             </w:r>
           </w:p>
         </w:tc>
@@ -5507,7 +5507,7 @@
               <w:rPr>
                 <w:sz w:val="14"/>
               </w:rPr>
-              <w:t>Vor Abgabe aktuell erfassen.</w:t>
+              <w:t>Erfasst und mit den tatsächlich laufenden Pods abgeglichen. Dev: sha256:114b3c9505cf4dde0e58101127f4e2ae6395928e7f013e33e7c8039cc2496490; Prod: sha256:8a30554bf682a9a326f1227ec0e3978eab03b982bbe41e0d13ab1aad21d379f6.</w:t>
             </w:r>
           </w:p>
         </w:tc>
@@ -5605,8 +5605,263 @@
         <w:t>Für die formale Endübergabe bleiben bewusst nur Werte offen, die sich bis zum letzten Projektcommit ändern können oder für die kein eindeutiger Primärnachweis vorliegt: finale HEADs beider Repositories, aktuell eingesetzte Image-Digests, finaler Alert-/Cluster-Snapshot sowie ein vollständig belegter Restore mit Prüfsummen- und Datenvergleich. Diese Punkte sind vor der Abgabe zu erfassen und in textdateien/offene_punkte.txt transparent zu behandeln.</w:t>
       </w:r>
     </w:p>
+    <w:p>
+      <w:r>
+        <w:t xml:space="preserve"/>
+      </w:r>
+    </w:p>
+    <w:p>
+      <w:pPr>
+        <w:pStyle w:val="Heading2"/>
+      </w:pPr>
+      <w:r>
+        <w:rPr>
+          <w:b/>
+        </w:rPr>
+        <w:t xml:space="preserve">AP33 – Finaler Betriebszustand und Live-Demo-Stand</w:t>
+      </w:r>
+    </w:p>
+    <w:p>
+      <w:r>
+        <w:t xml:space="preserve">Für die Live-Demonstration wurde der finale dokumentierte GitOps- und Kubernetes-Betriebszustand überprüft. Die laufenden Workloads wurden mit den in Git versionierten Sollständen abgeglichen.</w:t>
+      </w:r>
+    </w:p>
+    <w:p>
+      <w:r>
+        <w:rPr>
+          <w:b/>
+        </w:rPr>
+        <w:t xml:space="preserve">Finale Git-Stände</w:t>
+      </w:r>
+    </w:p>
+    <w:p>
+      <w:r>
+        <w:rPr>
+          <w:b/>
+        </w:rPr>
+        <w:t xml:space="preserve">pacman-app Commit: </w:t>
+      </w:r>
+      <w:r>
+        <w:t xml:space="preserve">a4c49abd81d9f5c4472b90110cb3fca5ae0348c2</w:t>
+      </w:r>
+    </w:p>
+    <w:p>
+      <w:r>
+        <w:rPr>
+          <w:b/>
+        </w:rPr>
+        <w:t xml:space="preserve">pacman-gitops Commit: </w:t>
+      </w:r>
+      <w:r>
+        <w:t xml:space="preserve">692b49bb3510a481406717c2fe4faa793f3c8e0f</w:t>
+      </w:r>
+    </w:p>
+    <w:p>
+      <w:r>
+        <w:rPr>
+          <w:b/>
+        </w:rPr>
+        <w:t xml:space="preserve">Argo-CD-Zustand</w:t>
+      </w:r>
+    </w:p>
+    <w:p>
+      <w:r>
+        <w:rPr>
+          <w:b/>
+        </w:rPr>
+        <w:t xml:space="preserve">pacman-dev: </w:t>
+      </w:r>
+      <w:r>
+        <w:t xml:space="preserve">Synced / Healthy</w:t>
+      </w:r>
+    </w:p>
+    <w:p>
+      <w:r>
+        <w:rPr>
+          <w:b/>
+        </w:rPr>
+        <w:t xml:space="preserve">pacman-prod: </w:t>
+      </w:r>
+      <w:r>
+        <w:t xml:space="preserve">Synced / Healthy</w:t>
+      </w:r>
+    </w:p>
+    <w:p>
+      <w:r>
+        <w:rPr>
+          <w:b/>
+        </w:rPr>
+        <w:t xml:space="preserve">Entwicklungsumgebung</w:t>
+      </w:r>
+    </w:p>
+    <w:p>
+      <w:r>
+        <w:rPr>
+          <w:b/>
+        </w:rPr>
+        <w:t xml:space="preserve">Pacman Deployment: </w:t>
+      </w:r>
+      <w:r>
+        <w:t xml:space="preserve">1/1 verfügbar</w:t>
+      </w:r>
+    </w:p>
+    <w:p>
+      <w:r>
+        <w:rPr>
+          <w:b/>
+        </w:rPr>
+        <w:t xml:space="preserve">MongoDB StatefulSet: </w:t>
+      </w:r>
+      <w:r>
+        <w:t xml:space="preserve">1/1 verfügbar</w:t>
+      </w:r>
+    </w:p>
+    <w:p>
+      <w:r>
+        <w:rPr>
+          <w:b/>
+        </w:rPr>
+        <w:t xml:space="preserve">Persistenz: </w:t>
+      </w:r>
+      <w:r>
+        <w:t xml:space="preserve">MongoDB-Daten-PVC und Backup-PVC jeweils Bound</w:t>
+      </w:r>
+    </w:p>
+    <w:p>
+      <w:r>
+        <w:rPr>
+          <w:b/>
+        </w:rPr>
+        <w:t xml:space="preserve">Horizontal Pod Autoscaler: </w:t>
+      </w:r>
+      <w:r>
+        <w:t xml:space="preserve">1 bis 3 Pacman-Replikate</w:t>
+      </w:r>
+    </w:p>
+    <w:p>
+      <w:r>
+        <w:rPr>
+          <w:b/>
+        </w:rPr>
+        <w:t xml:space="preserve">Image: </w:t>
+      </w:r>
+      <w:r>
+        <w:t xml:space="preserve">ghcr.io/isangare-ux/pacman-app:a4c49abd81d9f5c4472b90110cb3fca5ae0348c2</w:t>
+      </w:r>
+    </w:p>
+    <w:p>
+      <w:r>
+        <w:rPr>
+          <w:b/>
+        </w:rPr>
+        <w:t xml:space="preserve">Image Digest: </w:t>
+      </w:r>
+      <w:r>
+        <w:t xml:space="preserve">sha256:114b3c9505cf4dde0e58101127f4e2ae6395928e7f013e33e7c8039cc2496490</w:t>
+      </w:r>
+    </w:p>
+    <w:p>
+      <w:r>
+        <w:rPr>
+          <w:b/>
+        </w:rPr>
+        <w:t xml:space="preserve">Produktionsumgebung</w:t>
+      </w:r>
+    </w:p>
+    <w:p>
+      <w:r>
+        <w:rPr>
+          <w:b/>
+        </w:rPr>
+        <w:t xml:space="preserve">Pacman Deployment: </w:t>
+      </w:r>
+      <w:r>
+        <w:t xml:space="preserve">3/3 verfügbar</w:t>
+      </w:r>
+    </w:p>
+    <w:p>
+      <w:r>
+        <w:rPr>
+          <w:b/>
+        </w:rPr>
+        <w:t xml:space="preserve">MongoDB StatefulSet: </w:t>
+      </w:r>
+      <w:r>
+        <w:t xml:space="preserve">1/1 verfügbar</w:t>
+      </w:r>
+    </w:p>
+    <w:p>
+      <w:r>
+        <w:rPr>
+          <w:b/>
+        </w:rPr>
+        <w:t xml:space="preserve">Persistenz: </w:t>
+      </w:r>
+      <w:r>
+        <w:t xml:space="preserve">MongoDB-Daten-PVC und Backup-PVC jeweils Bound</w:t>
+      </w:r>
+    </w:p>
+    <w:p>
+      <w:r>
+        <w:rPr>
+          <w:b/>
+        </w:rPr>
+        <w:t xml:space="preserve">Horizontal Pod Autoscaler: </w:t>
+      </w:r>
+      <w:r>
+        <w:t xml:space="preserve">3 bis 6 Pacman-Replikate</w:t>
+      </w:r>
+    </w:p>
+    <w:p>
+      <w:r>
+        <w:rPr>
+          <w:b/>
+        </w:rPr>
+        <w:t xml:space="preserve">Image: </w:t>
+      </w:r>
+      <w:r>
+        <w:t xml:space="preserve">ghcr.io/isangare-ux/pacman-app:2ae1f2e41c992fdbb81107aac79e66afe7ef2ea1</w:t>
+      </w:r>
+    </w:p>
+    <w:p>
+      <w:r>
+        <w:rPr>
+          <w:b/>
+        </w:rPr>
+        <w:t xml:space="preserve">Image Digest: </w:t>
+      </w:r>
+      <w:r>
+        <w:t xml:space="preserve">sha256:8a30554bf682a9a326f1227ec0e3978eab03b982bbe41e0d13ab1aad21d379f6</w:t>
+      </w:r>
+    </w:p>
+    <w:p>
+      <w:r>
+        <w:rPr>
+          <w:b/>
+        </w:rPr>
+        <w:t xml:space="preserve">Backup und Restore</w:t>
+      </w:r>
+    </w:p>
+    <w:p>
+      <w:r>
+        <w:t xml:space="preserve">Mehrere geplante MongoDB-Backup-Jobs wurden erfolgreich abgeschlossen. Der manuelle Restore-Test wurde erfolgreich durchgeführt. Nach einem vorübergehend fehlgeschlagenen Produktions-Backup wurde im Rahmen von AP33 ein kontrollierter Nachtest aus demselben CronJob-Template gestartet. Der Nachtest wurde mit Complete 1/1 erfolgreich abgeschlossen.</w:t>
+      </w:r>
+    </w:p>
+    <w:p>
+      <w:r>
+        <w:rPr>
+          <w:b/>
+        </w:rPr>
+        <w:t xml:space="preserve">Ergebnis</w:t>
+      </w:r>
+    </w:p>
+    <w:p>
+      <w:r>
+        <w:t xml:space="preserve">Der Kubernetes-Istzustand entspricht dem im finalen GitOps-Stand definierten Sollzustand. Dev und Prod verwenden jeweils die in ihren GitOps-Overlays definierten Image-Versionen. Die Image-Digests bestätigen die tatsächlich ausgeführten Container-Images. Zum Zeitpunkt des Abschlussnachweises meldete Argo CD beide Applications als Synced und Healthy.</w:t>
+      </w:r>
+    </w:p>
     <w:sectPr>
-      <w:footerReference w:type="default" r:id="rId9"/>
+      <w:footerReference w:type="default" ns2:id="rId9"/>
       <w:pgSz w:w="12240" w:h="15840"/>
       <w:pgMar w:top="879" w:right="935" w:bottom="879" w:left="935" w:header="720" w:footer="720" w:gutter="0"/>
       <w:cols w:space="720"/>

</xml_diff>